<commit_message>
Version 2.0 (WBS and Gantt Chart)
Updating Project Planning Document with WBS and Gantt Chart
</commit_message>
<xml_diff>
--- a/CIS 4374 Project File.docx
+++ b/CIS 4374 Project File.docx
@@ -13,7 +13,7 @@
           <w:szCs w:val="22"/>
         </w:rPr>
       </w:pPr>
-      <w:bookmarkStart w:id="0" w:name="_Toc239968872"/>
+      <w:bookmarkStart w:id="0" w:name="_Toc240579371"/>
       <w:r>
         <w:rPr>
           <w:rFonts w:ascii="Times New Roman" w:hAnsi="Times New Roman" w:cs="Times New Roman"/>
@@ -131,7 +131,18 @@
           <w:szCs w:val="22"/>
           <w14:ligatures w14:val="standardContextual"/>
         </w:rPr>
-        <w:t xml:space="preserve"> 1.0</w:t>
+        <w:t xml:space="preserve"> </w:t>
+      </w:r>
+      <w:r>
+        <w:rPr>
+          <w:rFonts w:ascii="Times New Roman" w:eastAsiaTheme="minorHAnsi" w:hAnsi="Times New Roman" w:cs="Times New Roman"/>
+          <w:color w:val="auto"/>
+          <w:kern w:val="2"/>
+          <w:sz w:val="22"/>
+          <w:szCs w:val="22"/>
+          <w14:ligatures w14:val="standardContextual"/>
+        </w:rPr>
+        <w:t>2.0</w:t>
       </w:r>
       <w:r>
         <w:rPr>
@@ -257,7 +268,7 @@
             </w:rPr>
             <w:fldChar w:fldCharType="separate"/>
           </w:r>
-          <w:hyperlink w:anchor="_Toc239968872" w:history="1">
+          <w:hyperlink w:anchor="_Toc240579371" w:history="1">
             <w:r>
               <w:rPr>
                 <w:rStyle w:val="Hyperlink"/>
@@ -285,7 +296,7 @@
                 <w:noProof/>
                 <w:webHidden/>
               </w:rPr>
-              <w:instrText xml:space="preserve"> PAGEREF _Toc239968872 \h </w:instrText>
+              <w:instrText xml:space="preserve"> PAGEREF _Toc240579371 \h </w:instrText>
             </w:r>
             <w:r>
               <w:rPr>
@@ -327,7 +338,7 @@
               <w:noProof/>
             </w:rPr>
           </w:pPr>
-          <w:hyperlink w:anchor="_Toc239968873" w:history="1">
+          <w:hyperlink w:anchor="_Toc240579372" w:history="1">
             <w:r>
               <w:rPr>
                 <w:rStyle w:val="Hyperlink"/>
@@ -357,7 +368,7 @@
                 <w:noProof/>
                 <w:webHidden/>
               </w:rPr>
-              <w:instrText xml:space="preserve"> PAGEREF _Toc239968873 \h </w:instrText>
+              <w:instrText xml:space="preserve"> PAGEREF _Toc240579372 \h </w:instrText>
             </w:r>
             <w:r>
               <w:rPr>
@@ -399,7 +410,7 @@
               <w:noProof/>
             </w:rPr>
           </w:pPr>
-          <w:hyperlink w:anchor="_Toc239968874" w:history="1">
+          <w:hyperlink w:anchor="_Toc240579373" w:history="1">
             <w:r>
               <w:rPr>
                 <w:rStyle w:val="Hyperlink"/>
@@ -408,27 +419,7 @@
                 <w:bCs/>
                 <w:noProof/>
               </w:rPr>
-              <w:t>How Will the S</w:t>
-            </w:r>
-            <w:r>
-              <w:rPr>
-                <w:rStyle w:val="Hyperlink"/>
-                <w:rFonts w:ascii="Times New Roman" w:hAnsi="Times New Roman" w:cs="Times New Roman"/>
-                <w:b/>
-                <w:bCs/>
-                <w:noProof/>
-              </w:rPr>
-              <w:t>mart</w:t>
-            </w:r>
-            <w:r>
-              <w:rPr>
-                <w:rStyle w:val="Hyperlink"/>
-                <w:rFonts w:ascii="Times New Roman" w:hAnsi="Times New Roman" w:cs="Times New Roman"/>
-                <w:b/>
-                <w:bCs/>
-                <w:noProof/>
-              </w:rPr>
-              <w:t xml:space="preserve"> Parking Application We Are Building Be Different?</w:t>
+              <w:t>How Will the Smart Parking Application We Are Building Be Different?</w:t>
             </w:r>
             <w:r>
               <w:rPr>
@@ -449,7 +440,7 @@
                 <w:noProof/>
                 <w:webHidden/>
               </w:rPr>
-              <w:instrText xml:space="preserve"> PAGEREF _Toc239968874 \h </w:instrText>
+              <w:instrText xml:space="preserve"> PAGEREF _Toc240579373 \h </w:instrText>
             </w:r>
             <w:r>
               <w:rPr>
@@ -491,7 +482,7 @@
               <w:noProof/>
             </w:rPr>
           </w:pPr>
-          <w:hyperlink w:anchor="_Toc239968875" w:history="1">
+          <w:hyperlink w:anchor="_Toc240579374" w:history="1">
             <w:r>
               <w:rPr>
                 <w:rStyle w:val="Hyperlink"/>
@@ -521,7 +512,7 @@
                 <w:noProof/>
                 <w:webHidden/>
               </w:rPr>
-              <w:instrText xml:space="preserve"> PAGEREF _Toc239968875 \h </w:instrText>
+              <w:instrText xml:space="preserve"> PAGEREF _Toc240579374 \h </w:instrText>
             </w:r>
             <w:r>
               <w:rPr>
@@ -563,7 +554,7 @@
               <w:noProof/>
             </w:rPr>
           </w:pPr>
-          <w:hyperlink w:anchor="_Toc239968876" w:history="1">
+          <w:hyperlink w:anchor="_Toc240579375" w:history="1">
             <w:r>
               <w:rPr>
                 <w:rStyle w:val="Hyperlink"/>
@@ -593,7 +584,7 @@
                 <w:noProof/>
                 <w:webHidden/>
               </w:rPr>
-              <w:instrText xml:space="preserve"> PAGEREF _Toc239968876 \h </w:instrText>
+              <w:instrText xml:space="preserve"> PAGEREF _Toc240579375 \h </w:instrText>
             </w:r>
             <w:r>
               <w:rPr>
@@ -614,6 +605,223 @@
                 <w:webHidden/>
               </w:rPr>
               <w:t>4</w:t>
+            </w:r>
+            <w:r>
+              <w:rPr>
+                <w:noProof/>
+                <w:webHidden/>
+              </w:rPr>
+              <w:fldChar w:fldCharType="end"/>
+            </w:r>
+          </w:hyperlink>
+        </w:p>
+        <w:p>
+          <w:pPr>
+            <w:pStyle w:val="TOC1"/>
+            <w:tabs>
+              <w:tab w:val="right" w:leader="dot" w:pos="9350"/>
+            </w:tabs>
+            <w:rPr>
+              <w:rFonts w:eastAsiaTheme="minorEastAsia"/>
+              <w:noProof/>
+            </w:rPr>
+          </w:pPr>
+          <w:hyperlink w:anchor="_Toc240579376" w:history="1">
+            <w:r>
+              <w:rPr>
+                <w:rStyle w:val="Hyperlink"/>
+                <w:rFonts w:ascii="Times New Roman" w:hAnsi="Times New Roman" w:cs="Times New Roman"/>
+                <w:b/>
+                <w:bCs/>
+                <w:noProof/>
+              </w:rPr>
+              <w:t>Project Planning</w:t>
+            </w:r>
+            <w:r>
+              <w:rPr>
+                <w:noProof/>
+                <w:webHidden/>
+              </w:rPr>
+              <w:tab/>
+              <w:t>4.</w:t>
+            </w:r>
+            <w:r>
+              <w:rPr>
+                <w:noProof/>
+                <w:webHidden/>
+              </w:rPr>
+              <w:fldChar w:fldCharType="begin"/>
+            </w:r>
+            <w:r>
+              <w:rPr>
+                <w:noProof/>
+                <w:webHidden/>
+              </w:rPr>
+              <w:instrText xml:space="preserve"> PAGEREF _Toc240579376 \h </w:instrText>
+            </w:r>
+            <w:r>
+              <w:rPr>
+                <w:noProof/>
+                <w:webHidden/>
+              </w:rPr>
+            </w:r>
+            <w:r>
+              <w:rPr>
+                <w:noProof/>
+                <w:webHidden/>
+              </w:rPr>
+              <w:fldChar w:fldCharType="separate"/>
+            </w:r>
+            <w:r>
+              <w:rPr>
+                <w:noProof/>
+                <w:webHidden/>
+              </w:rPr>
+              <w:t>7</w:t>
+            </w:r>
+            <w:r>
+              <w:rPr>
+                <w:noProof/>
+                <w:webHidden/>
+              </w:rPr>
+              <w:fldChar w:fldCharType="end"/>
+            </w:r>
+          </w:hyperlink>
+        </w:p>
+        <w:p>
+          <w:pPr>
+            <w:pStyle w:val="TOC2"/>
+            <w:tabs>
+              <w:tab w:val="right" w:leader="dot" w:pos="9350"/>
+            </w:tabs>
+            <w:rPr>
+              <w:rFonts w:eastAsiaTheme="minorEastAsia"/>
+              <w:noProof/>
+            </w:rPr>
+          </w:pPr>
+          <w:hyperlink w:anchor="_Toc240579377" w:history="1">
+            <w:r>
+              <w:rPr>
+                <w:rStyle w:val="Hyperlink"/>
+                <w:rFonts w:ascii="Times New Roman" w:hAnsi="Times New Roman" w:cs="Times New Roman"/>
+                <w:b/>
+                <w:bCs/>
+                <w:noProof/>
+              </w:rPr>
+              <w:t>Work Breakdown Structure (WBS) - Complete Task List</w:t>
+            </w:r>
+            <w:r>
+              <w:rPr>
+                <w:noProof/>
+                <w:webHidden/>
+              </w:rPr>
+              <w:tab/>
+            </w:r>
+            <w:r>
+              <w:rPr>
+                <w:noProof/>
+                <w:webHidden/>
+              </w:rPr>
+              <w:fldChar w:fldCharType="begin"/>
+            </w:r>
+            <w:r>
+              <w:rPr>
+                <w:noProof/>
+                <w:webHidden/>
+              </w:rPr>
+              <w:instrText xml:space="preserve"> PAGEREF _Toc240579377 \h </w:instrText>
+            </w:r>
+            <w:r>
+              <w:rPr>
+                <w:noProof/>
+                <w:webHidden/>
+              </w:rPr>
+            </w:r>
+            <w:r>
+              <w:rPr>
+                <w:noProof/>
+                <w:webHidden/>
+              </w:rPr>
+              <w:fldChar w:fldCharType="separate"/>
+            </w:r>
+            <w:r>
+              <w:rPr>
+                <w:noProof/>
+                <w:webHidden/>
+              </w:rPr>
+              <w:t>7</w:t>
+            </w:r>
+            <w:r>
+              <w:rPr>
+                <w:noProof/>
+                <w:webHidden/>
+              </w:rPr>
+              <w:fldChar w:fldCharType="end"/>
+            </w:r>
+          </w:hyperlink>
+        </w:p>
+        <w:p>
+          <w:pPr>
+            <w:pStyle w:val="TOC2"/>
+            <w:tabs>
+              <w:tab w:val="right" w:leader="dot" w:pos="9350"/>
+            </w:tabs>
+            <w:rPr>
+              <w:rFonts w:eastAsiaTheme="minorEastAsia"/>
+              <w:noProof/>
+            </w:rPr>
+          </w:pPr>
+          <w:hyperlink w:anchor="_Toc240579378" w:history="1">
+            <w:r>
+              <w:rPr>
+                <w:rStyle w:val="Hyperlink"/>
+                <w:rFonts w:ascii="Times New Roman" w:hAnsi="Times New Roman" w:cs="Times New Roman"/>
+                <w:b/>
+                <w:bCs/>
+                <w:noProof/>
+              </w:rPr>
+              <w:t>Project Timeline - Gantt Chart</w:t>
+            </w:r>
+            <w:r>
+              <w:rPr>
+                <w:noProof/>
+                <w:webHidden/>
+              </w:rPr>
+              <w:tab/>
+            </w:r>
+            <w:r>
+              <w:rPr>
+                <w:noProof/>
+                <w:webHidden/>
+              </w:rPr>
+              <w:fldChar w:fldCharType="begin"/>
+            </w:r>
+            <w:r>
+              <w:rPr>
+                <w:noProof/>
+                <w:webHidden/>
+              </w:rPr>
+              <w:instrText xml:space="preserve"> PAGEREF _Toc240579378 \h </w:instrText>
+            </w:r>
+            <w:r>
+              <w:rPr>
+                <w:noProof/>
+                <w:webHidden/>
+              </w:rPr>
+            </w:r>
+            <w:r>
+              <w:rPr>
+                <w:noProof/>
+                <w:webHidden/>
+              </w:rPr>
+              <w:fldChar w:fldCharType="separate"/>
+            </w:r>
+            <w:r>
+              <w:rPr>
+                <w:noProof/>
+                <w:webHidden/>
+              </w:rPr>
+              <w:t>9</w:t>
             </w:r>
             <w:r>
               <w:rPr>
@@ -807,21 +1015,20 @@
           <w:b/>
           <w:bCs/>
           <w:color w:val="auto"/>
-          <w:sz w:val="22"/>
-          <w:szCs w:val="22"/>
-        </w:rPr>
-      </w:pPr>
-      <w:bookmarkStart w:id="1" w:name="_Toc239968873"/>
+          <w:sz w:val="26"/>
+          <w:szCs w:val="26"/>
+        </w:rPr>
+      </w:pPr>
+      <w:bookmarkStart w:id="1" w:name="_Toc240579372"/>
       <w:r>
         <w:rPr>
           <w:rFonts w:ascii="Times New Roman" w:hAnsi="Times New Roman" w:cs="Times New Roman"/>
           <w:b/>
           <w:bCs/>
           <w:color w:val="auto"/>
-          <w:sz w:val="22"/>
-          <w:szCs w:val="22"/>
-        </w:rPr>
-        <w:lastRenderedPageBreak/>
+          <w:sz w:val="26"/>
+          <w:szCs w:val="26"/>
+        </w:rPr>
         <w:t>1. Project Research and Existing Software:</w:t>
       </w:r>
       <w:bookmarkEnd w:id="1"/>
@@ -848,25 +1055,15 @@
           <w:sz w:val="22"/>
           <w:szCs w:val="22"/>
         </w:rPr>
-        <w:t xml:space="preserve">Existing software solutions like ParkMobile, </w:t>
-      </w:r>
-      <w:proofErr w:type="spellStart"/>
-      <w:r>
-        <w:rPr>
-          <w:rFonts w:ascii="Times New Roman" w:hAnsi="Times New Roman" w:cs="Times New Roman"/>
-          <w:sz w:val="22"/>
-          <w:szCs w:val="22"/>
-        </w:rPr>
-        <w:t>SpotHero</w:t>
-      </w:r>
-      <w:proofErr w:type="spellEnd"/>
-      <w:r>
-        <w:rPr>
-          <w:rFonts w:ascii="Times New Roman" w:hAnsi="Times New Roman" w:cs="Times New Roman"/>
-          <w:sz w:val="22"/>
-          <w:szCs w:val="22"/>
-        </w:rPr>
-        <w:t xml:space="preserve">, Passport Parking, and Easy Park. The following table will go into more detail about these existing solutions. </w:t>
+        <w:t xml:space="preserve">Existing software solutions like ParkMobile, SpotHero, Passport Parking, and Easy Park. The following table will go into more detail about these existing solutions. </w:t>
+      </w:r>
+      <w:r>
+        <w:rPr>
+          <w:rFonts w:ascii="Times New Roman" w:hAnsi="Times New Roman" w:cs="Times New Roman"/>
+          <w:sz w:val="22"/>
+          <w:szCs w:val="22"/>
+        </w:rPr>
+        <w:t xml:space="preserve"> </w:t>
       </w:r>
     </w:p>
     <w:tbl>
@@ -1300,7 +1497,6 @@
                 <w:szCs w:val="22"/>
               </w:rPr>
             </w:pPr>
-            <w:proofErr w:type="spellStart"/>
             <w:r>
               <w:rPr>
                 <w:rFonts w:ascii="Times New Roman" w:hAnsi="Times New Roman" w:cs="Times New Roman"/>
@@ -1309,7 +1505,6 @@
               </w:rPr>
               <w:t>SpotHero</w:t>
             </w:r>
-            <w:proofErr w:type="spellEnd"/>
           </w:p>
         </w:tc>
         <w:tc>
@@ -1912,6 +2107,7 @@
           <w:sz w:val="22"/>
           <w:szCs w:val="22"/>
         </w:rPr>
+        <w:lastRenderedPageBreak/>
         <w:t>Key Points: The existing solutions for this use show that this industry already has some apps that have strong capabilities. However, there is room for improvement for each one, which our application could excel in.</w:t>
       </w:r>
     </w:p>
@@ -1927,7 +2123,7 @@
           <w:szCs w:val="22"/>
         </w:rPr>
       </w:pPr>
-      <w:bookmarkStart w:id="2" w:name="_Toc239968874"/>
+      <w:bookmarkStart w:id="2" w:name="_Toc240579373"/>
       <w:r>
         <w:rPr>
           <w:rFonts w:ascii="Times New Roman" w:hAnsi="Times New Roman" w:cs="Times New Roman"/>
@@ -1937,7 +2133,6 @@
           <w:sz w:val="22"/>
           <w:szCs w:val="22"/>
         </w:rPr>
-        <w:lastRenderedPageBreak/>
         <w:t>How Will the Smar</w:t>
       </w:r>
       <w:r>
@@ -2021,19 +2216,19 @@
           <w:b/>
           <w:bCs/>
           <w:color w:val="auto"/>
-          <w:sz w:val="22"/>
-          <w:szCs w:val="22"/>
-        </w:rPr>
-      </w:pPr>
-      <w:bookmarkStart w:id="3" w:name="_Toc239968875"/>
+          <w:sz w:val="26"/>
+          <w:szCs w:val="26"/>
+        </w:rPr>
+      </w:pPr>
+      <w:bookmarkStart w:id="3" w:name="_Toc240579374"/>
       <w:r>
         <w:rPr>
           <w:rFonts w:ascii="Times New Roman" w:hAnsi="Times New Roman" w:cs="Times New Roman"/>
           <w:b/>
           <w:bCs/>
           <w:color w:val="auto"/>
-          <w:sz w:val="22"/>
-          <w:szCs w:val="22"/>
+          <w:sz w:val="26"/>
+          <w:szCs w:val="26"/>
         </w:rPr>
         <w:t>2. Project Vision and Scope:</w:t>
       </w:r>
@@ -2076,43 +2271,7 @@
           <w:sz w:val="22"/>
           <w:szCs w:val="22"/>
         </w:rPr>
-        <w:t>WE ARE $</w:t>
-      </w:r>
-      <w:proofErr w:type="spellStart"/>
-      <w:r>
-        <w:rPr>
-          <w:rFonts w:ascii="Times New Roman" w:hAnsi="Times New Roman" w:cs="Times New Roman"/>
-          <w:sz w:val="22"/>
-          <w:szCs w:val="22"/>
-        </w:rPr>
-        <w:t>oftware</w:t>
-      </w:r>
-      <w:proofErr w:type="spellEnd"/>
-      <w:r>
-        <w:rPr>
-          <w:rFonts w:ascii="Times New Roman" w:hAnsi="Times New Roman" w:cs="Times New Roman"/>
-          <w:sz w:val="22"/>
-          <w:szCs w:val="22"/>
-        </w:rPr>
-        <w:t xml:space="preserve"> ¢</w:t>
-      </w:r>
-      <w:proofErr w:type="spellStart"/>
-      <w:r>
-        <w:rPr>
-          <w:rFonts w:ascii="Times New Roman" w:hAnsi="Times New Roman" w:cs="Times New Roman"/>
-          <w:sz w:val="22"/>
-          <w:szCs w:val="22"/>
-        </w:rPr>
-        <w:t>orp</w:t>
-      </w:r>
-      <w:proofErr w:type="spellEnd"/>
-      <w:r>
-        <w:rPr>
-          <w:rFonts w:ascii="Times New Roman" w:hAnsi="Times New Roman" w:cs="Times New Roman"/>
-          <w:sz w:val="22"/>
-          <w:szCs w:val="22"/>
-        </w:rPr>
-        <w:t xml:space="preserve"> is a software development studio that aims to provide seamless solutions to issues customers may have. The company has an unlimited budget and resources that will allow it to get together development teams and the technologies to support their projects. The goal for this project is to develop a project management plan for the creation of a Smart Parking Platform system.  </w:t>
+        <w:t xml:space="preserve">WE ARE $oftware ¢orp is a software development studio that aims to provide seamless solutions to issues customers may have. The company has an unlimited budget and resources that will allow it to get together development teams and the technologies to support their projects. The goal for this project is to develop a project management plan for the creation of a Smart Parking Platform system.  </w:t>
       </w:r>
     </w:p>
     <w:p>
@@ -2166,187 +2325,79 @@
           <w:sz w:val="22"/>
           <w:szCs w:val="22"/>
         </w:rPr>
-        <w:t>was acquired by WE ARE $</w:t>
-      </w:r>
-      <w:proofErr w:type="spellStart"/>
-      <w:r>
-        <w:rPr>
-          <w:rFonts w:ascii="Times New Roman" w:hAnsi="Times New Roman" w:cs="Times New Roman"/>
-          <w:sz w:val="22"/>
-          <w:szCs w:val="22"/>
-        </w:rPr>
-        <w:t>oftware</w:t>
-      </w:r>
-      <w:proofErr w:type="spellEnd"/>
-      <w:r>
-        <w:rPr>
-          <w:rFonts w:ascii="Times New Roman" w:hAnsi="Times New Roman" w:cs="Times New Roman"/>
-          <w:sz w:val="22"/>
-          <w:szCs w:val="22"/>
-        </w:rPr>
-        <w:t xml:space="preserve"> ¢</w:t>
-      </w:r>
-      <w:proofErr w:type="spellStart"/>
-      <w:r>
-        <w:rPr>
-          <w:rFonts w:ascii="Times New Roman" w:hAnsi="Times New Roman" w:cs="Times New Roman"/>
-          <w:sz w:val="22"/>
-          <w:szCs w:val="22"/>
-        </w:rPr>
-        <w:t>orp</w:t>
-      </w:r>
-      <w:proofErr w:type="spellEnd"/>
-      <w:r>
-        <w:rPr>
-          <w:rFonts w:ascii="Times New Roman" w:hAnsi="Times New Roman" w:cs="Times New Roman"/>
+        <w:t xml:space="preserve">was acquired by WE ARE $oftware ¢orp </w:t>
+      </w:r>
+      <w:r>
+        <w:rPr>
+          <w:rFonts w:ascii="Times New Roman" w:hAnsi="Times New Roman" w:cs="Times New Roman"/>
+          <w:sz w:val="22"/>
+          <w:szCs w:val="22"/>
+        </w:rPr>
+        <w:t xml:space="preserve">through a competitive approval proposal that was initiated by a city transportation department who wants to improve parking availability, </w:t>
+      </w:r>
+      <w:r>
+        <w:rPr>
+          <w:rFonts w:ascii="Times New Roman" w:hAnsi="Times New Roman" w:cs="Times New Roman"/>
+          <w:sz w:val="22"/>
+          <w:szCs w:val="22"/>
+        </w:rPr>
+        <w:t xml:space="preserve">improve reservation </w:t>
+      </w:r>
+      <w:r>
+        <w:rPr>
+          <w:rFonts w:ascii="Times New Roman" w:hAnsi="Times New Roman" w:cs="Times New Roman"/>
+          <w:sz w:val="22"/>
+          <w:szCs w:val="22"/>
+        </w:rPr>
+        <w:t xml:space="preserve">capabilities, reduce traffic, and to increase the utilization of parking facilities. There was (RFP) Request for Proposal for a web and mobile platform that can provide real-time parking availability, reservations, payments, navigation, and management tools. Because of WE ARE $oftware ¢orp’s technical approaches and project management capabilities, we were selected to develop the solution. The project will be developed with an unlimited budget and resources but must be done within the timeline. </w:t>
+      </w:r>
+    </w:p>
+    <w:p>
+      <w:pPr>
+        <w:rPr>
+          <w:rFonts w:ascii="Times New Roman" w:hAnsi="Times New Roman" w:cs="Times New Roman"/>
+          <w:b/>
+          <w:bCs/>
+          <w:sz w:val="22"/>
+          <w:szCs w:val="22"/>
+        </w:rPr>
+      </w:pPr>
+      <w:r>
+        <w:rPr>
+          <w:rFonts w:ascii="Times New Roman" w:hAnsi="Times New Roman" w:cs="Times New Roman"/>
+          <w:b/>
+          <w:bCs/>
+          <w:sz w:val="22"/>
+          <w:szCs w:val="22"/>
+        </w:rPr>
+        <w:t>Rough Overview:</w:t>
+      </w:r>
+      <w:r>
+        <w:rPr>
+          <w:rFonts w:ascii="Times New Roman" w:hAnsi="Times New Roman" w:cs="Times New Roman"/>
+          <w:b/>
+          <w:bCs/>
           <w:sz w:val="22"/>
           <w:szCs w:val="22"/>
         </w:rPr>
         <w:t xml:space="preserve"> </w:t>
       </w:r>
-      <w:r>
-        <w:rPr>
-          <w:rFonts w:ascii="Times New Roman" w:hAnsi="Times New Roman" w:cs="Times New Roman"/>
-          <w:sz w:val="22"/>
-          <w:szCs w:val="22"/>
-        </w:rPr>
-        <w:t xml:space="preserve">through a competitive approval proposal that was initiated by a city transportation department who wants to improve parking availability, </w:t>
-      </w:r>
-      <w:r>
-        <w:rPr>
-          <w:rFonts w:ascii="Times New Roman" w:hAnsi="Times New Roman" w:cs="Times New Roman"/>
-          <w:sz w:val="22"/>
-          <w:szCs w:val="22"/>
-        </w:rPr>
-        <w:t xml:space="preserve">improve reservation </w:t>
-      </w:r>
-      <w:r>
-        <w:rPr>
-          <w:rFonts w:ascii="Times New Roman" w:hAnsi="Times New Roman" w:cs="Times New Roman"/>
-          <w:sz w:val="22"/>
-          <w:szCs w:val="22"/>
-        </w:rPr>
-        <w:t xml:space="preserve">capabilities, reduce traffic, and to increase the utilization of parking facilities. There was (RFP) Request for Proposal for a web and mobile platform that can provide real-time parking availability, reservations, payments, navigation, and management tools. </w:t>
-      </w:r>
-      <w:proofErr w:type="gramStart"/>
-      <w:r>
-        <w:rPr>
-          <w:rFonts w:ascii="Times New Roman" w:hAnsi="Times New Roman" w:cs="Times New Roman"/>
-          <w:sz w:val="22"/>
-          <w:szCs w:val="22"/>
-        </w:rPr>
-        <w:t>Because of</w:t>
-      </w:r>
-      <w:proofErr w:type="gramEnd"/>
-      <w:r>
-        <w:rPr>
-          <w:rFonts w:ascii="Times New Roman" w:hAnsi="Times New Roman" w:cs="Times New Roman"/>
-          <w:sz w:val="22"/>
-          <w:szCs w:val="22"/>
-        </w:rPr>
-        <w:t xml:space="preserve"> WE ARE $</w:t>
-      </w:r>
-      <w:proofErr w:type="spellStart"/>
-      <w:r>
-        <w:rPr>
-          <w:rFonts w:ascii="Times New Roman" w:hAnsi="Times New Roman" w:cs="Times New Roman"/>
-          <w:sz w:val="22"/>
-          <w:szCs w:val="22"/>
-        </w:rPr>
-        <w:t>oftware</w:t>
-      </w:r>
-      <w:proofErr w:type="spellEnd"/>
-      <w:r>
-        <w:rPr>
-          <w:rFonts w:ascii="Times New Roman" w:hAnsi="Times New Roman" w:cs="Times New Roman"/>
-          <w:sz w:val="22"/>
-          <w:szCs w:val="22"/>
-        </w:rPr>
-        <w:t xml:space="preserve"> ¢</w:t>
-      </w:r>
-      <w:proofErr w:type="spellStart"/>
-      <w:r>
-        <w:rPr>
-          <w:rFonts w:ascii="Times New Roman" w:hAnsi="Times New Roman" w:cs="Times New Roman"/>
-          <w:sz w:val="22"/>
-          <w:szCs w:val="22"/>
-        </w:rPr>
-        <w:t>orp’s</w:t>
-      </w:r>
-      <w:proofErr w:type="spellEnd"/>
-      <w:r>
-        <w:rPr>
-          <w:rFonts w:ascii="Times New Roman" w:hAnsi="Times New Roman" w:cs="Times New Roman"/>
-          <w:sz w:val="22"/>
-          <w:szCs w:val="22"/>
-        </w:rPr>
-        <w:t xml:space="preserve"> technical approaches and project management capabilities, we were selected to develop the solution. The project will be developed with an unlimited budget and resources but must be done within the timeline. </w:t>
-      </w:r>
-    </w:p>
-    <w:p>
-      <w:pPr>
-        <w:rPr>
-          <w:rFonts w:ascii="Times New Roman" w:hAnsi="Times New Roman" w:cs="Times New Roman"/>
-          <w:b/>
-          <w:bCs/>
-          <w:sz w:val="22"/>
-          <w:szCs w:val="22"/>
-        </w:rPr>
-      </w:pPr>
-      <w:r>
-        <w:rPr>
-          <w:rFonts w:ascii="Times New Roman" w:hAnsi="Times New Roman" w:cs="Times New Roman"/>
-          <w:b/>
-          <w:bCs/>
-          <w:sz w:val="22"/>
-          <w:szCs w:val="22"/>
-        </w:rPr>
-        <w:t>Rough Overview:</w:t>
-      </w:r>
-      <w:r>
-        <w:rPr>
-          <w:rFonts w:ascii="Times New Roman" w:hAnsi="Times New Roman" w:cs="Times New Roman"/>
-          <w:b/>
-          <w:bCs/>
-          <w:sz w:val="22"/>
-          <w:szCs w:val="22"/>
-        </w:rPr>
-        <w:t xml:space="preserve"> </w:t>
-      </w:r>
-    </w:p>
-    <w:p>
-      <w:pPr>
-        <w:rPr>
-          <w:rFonts w:ascii="Times New Roman" w:hAnsi="Times New Roman" w:cs="Times New Roman"/>
-          <w:sz w:val="22"/>
-          <w:szCs w:val="22"/>
-        </w:rPr>
-      </w:pPr>
-      <w:r>
-        <w:rPr>
-          <w:rFonts w:ascii="Times New Roman" w:hAnsi="Times New Roman" w:cs="Times New Roman"/>
-          <w:sz w:val="22"/>
-          <w:szCs w:val="22"/>
-        </w:rPr>
-        <w:t xml:space="preserve">The proposed Smart Parking Platform </w:t>
-      </w:r>
-      <w:proofErr w:type="gramStart"/>
-      <w:r>
-        <w:rPr>
-          <w:rFonts w:ascii="Times New Roman" w:hAnsi="Times New Roman" w:cs="Times New Roman"/>
-          <w:sz w:val="22"/>
-          <w:szCs w:val="22"/>
-        </w:rPr>
-        <w:t>is being</w:t>
-      </w:r>
-      <w:proofErr w:type="gramEnd"/>
-      <w:r>
-        <w:rPr>
-          <w:rFonts w:ascii="Times New Roman" w:hAnsi="Times New Roman" w:cs="Times New Roman"/>
-          <w:sz w:val="22"/>
-          <w:szCs w:val="22"/>
-        </w:rPr>
-        <w:t xml:space="preserve"> created to address the issue regarding people spending too much time trying to get parking. There is also a need for parking operators to have more efficient ways to manage occupancy, pricing, and utilization. For this project, there is a huge emphasis on real-time availability, interactive maps, reservations, payments, analytics, receipts, notifications, </w:t>
+    </w:p>
+    <w:p>
+      <w:pPr>
+        <w:rPr>
+          <w:rFonts w:ascii="Times New Roman" w:hAnsi="Times New Roman" w:cs="Times New Roman"/>
+          <w:sz w:val="22"/>
+          <w:szCs w:val="22"/>
+        </w:rPr>
+      </w:pPr>
+      <w:r>
+        <w:rPr>
+          <w:rFonts w:ascii="Times New Roman" w:hAnsi="Times New Roman" w:cs="Times New Roman"/>
+          <w:sz w:val="22"/>
+          <w:szCs w:val="22"/>
+        </w:rPr>
+        <w:t xml:space="preserve">The proposed Smart Parking Platform is being created to address the issue regarding people spending too much time trying to get parking. There is also a need for parking operators to have more efficient ways to manage occupancy, pricing, and utilization. For this project, there is a huge emphasis on real-time availability, interactive maps, reservations, payments, analytics, receipts, notifications, </w:t>
       </w:r>
       <w:r>
         <w:rPr>
@@ -2390,21 +2441,20 @@
           <w:b/>
           <w:bCs/>
           <w:color w:val="auto"/>
-          <w:sz w:val="22"/>
-          <w:szCs w:val="22"/>
-        </w:rPr>
-      </w:pPr>
-      <w:bookmarkStart w:id="4" w:name="_Toc239968876"/>
+          <w:sz w:val="26"/>
+          <w:szCs w:val="26"/>
+        </w:rPr>
+      </w:pPr>
+      <w:bookmarkStart w:id="4" w:name="_Toc240579375"/>
       <w:r>
         <w:rPr>
           <w:rFonts w:ascii="Times New Roman" w:hAnsi="Times New Roman" w:cs="Times New Roman"/>
           <w:b/>
           <w:bCs/>
           <w:color w:val="auto"/>
-          <w:sz w:val="22"/>
-          <w:szCs w:val="22"/>
-        </w:rPr>
-        <w:lastRenderedPageBreak/>
+          <w:sz w:val="26"/>
+          <w:szCs w:val="26"/>
+        </w:rPr>
         <w:t>3. Draft of SRS with Use Cases</w:t>
       </w:r>
       <w:bookmarkEnd w:id="4"/>
@@ -3266,6 +3316,7 @@
           <w:sz w:val="22"/>
           <w:szCs w:val="22"/>
         </w:rPr>
+        <w:lastRenderedPageBreak/>
         <w:br/>
       </w:r>
       <w:r>
@@ -3286,7 +3337,6 @@
           <w:sz w:val="22"/>
           <w:szCs w:val="22"/>
         </w:rPr>
-        <w:lastRenderedPageBreak/>
         <w:t>Use Case 4</w:t>
       </w:r>
       <w:r>
@@ -5205,9 +5255,508 @@
         </w:rPr>
       </w:pPr>
     </w:p>
+    <w:p>
+      <w:pPr>
+        <w:rPr>
+          <w:rFonts w:ascii="Times New Roman" w:hAnsi="Times New Roman" w:cs="Times New Roman"/>
+          <w:sz w:val="22"/>
+          <w:szCs w:val="22"/>
+        </w:rPr>
+      </w:pPr>
+    </w:p>
+    <w:p>
+      <w:pPr>
+        <w:rPr>
+          <w:rFonts w:ascii="Times New Roman" w:hAnsi="Times New Roman" w:cs="Times New Roman"/>
+          <w:sz w:val="22"/>
+          <w:szCs w:val="22"/>
+        </w:rPr>
+      </w:pPr>
+    </w:p>
+    <w:p>
+      <w:pPr>
+        <w:pStyle w:val="Heading1"/>
+        <w:rPr>
+          <w:rFonts w:ascii="Times New Roman" w:hAnsi="Times New Roman" w:cs="Times New Roman"/>
+          <w:b/>
+          <w:bCs/>
+          <w:color w:val="auto"/>
+          <w:sz w:val="26"/>
+          <w:szCs w:val="26"/>
+        </w:rPr>
+      </w:pPr>
+      <w:bookmarkStart w:id="5" w:name="_Toc240579376"/>
+      <w:r>
+        <w:rPr>
+          <w:rFonts w:ascii="Times New Roman" w:hAnsi="Times New Roman" w:cs="Times New Roman"/>
+          <w:b/>
+          <w:bCs/>
+          <w:color w:val="auto"/>
+          <w:sz w:val="26"/>
+          <w:szCs w:val="26"/>
+        </w:rPr>
+        <w:lastRenderedPageBreak/>
+        <w:t xml:space="preserve">4. </w:t>
+      </w:r>
+      <w:r>
+        <w:rPr>
+          <w:rFonts w:ascii="Times New Roman" w:hAnsi="Times New Roman" w:cs="Times New Roman"/>
+          <w:b/>
+          <w:bCs/>
+          <w:color w:val="auto"/>
+          <w:sz w:val="26"/>
+          <w:szCs w:val="26"/>
+        </w:rPr>
+        <w:t>Project Planning</w:t>
+      </w:r>
+      <w:bookmarkEnd w:id="5"/>
+    </w:p>
+    <w:p>
+      <w:pPr>
+        <w:pStyle w:val="Heading2"/>
+        <w:rPr>
+          <w:rFonts w:ascii="Times New Roman" w:hAnsi="Times New Roman" w:cs="Times New Roman"/>
+          <w:b/>
+          <w:bCs/>
+          <w:color w:val="auto"/>
+          <w:sz w:val="22"/>
+          <w:szCs w:val="22"/>
+        </w:rPr>
+      </w:pPr>
+      <w:bookmarkStart w:id="6" w:name="_Toc240579377"/>
+      <w:r>
+        <w:rPr>
+          <w:rFonts w:ascii="Times New Roman" w:hAnsi="Times New Roman" w:cs="Times New Roman"/>
+          <w:b/>
+          <w:bCs/>
+          <w:color w:val="auto"/>
+          <w:sz w:val="22"/>
+          <w:szCs w:val="22"/>
+        </w:rPr>
+        <w:t>Work Breakdown Structure (WBS) - Complete Task List</w:t>
+      </w:r>
+      <w:bookmarkEnd w:id="6"/>
+    </w:p>
+    <w:p>
+      <w:pPr>
+        <w:rPr>
+          <w:rFonts w:ascii="Times New Roman" w:hAnsi="Times New Roman" w:cs="Times New Roman"/>
+          <w:sz w:val="22"/>
+          <w:szCs w:val="22"/>
+        </w:rPr>
+      </w:pPr>
+      <w:r>
+        <w:rPr>
+          <w:rFonts w:ascii="Times New Roman" w:hAnsi="Times New Roman" w:cs="Times New Roman"/>
+          <w:sz w:val="22"/>
+          <w:szCs w:val="22"/>
+        </w:rPr>
+        <w:t>Th</w:t>
+      </w:r>
+      <w:r>
+        <w:rPr>
+          <w:rFonts w:ascii="Times New Roman" w:hAnsi="Times New Roman" w:cs="Times New Roman"/>
+          <w:sz w:val="22"/>
+          <w:szCs w:val="22"/>
+        </w:rPr>
+        <w:t>ese</w:t>
+      </w:r>
+      <w:r>
+        <w:rPr>
+          <w:rFonts w:ascii="Times New Roman" w:hAnsi="Times New Roman" w:cs="Times New Roman"/>
+          <w:sz w:val="22"/>
+          <w:szCs w:val="22"/>
+        </w:rPr>
+        <w:t xml:space="preserve"> image</w:t>
+      </w:r>
+      <w:r>
+        <w:rPr>
+          <w:rFonts w:ascii="Times New Roman" w:hAnsi="Times New Roman" w:cs="Times New Roman"/>
+          <w:sz w:val="22"/>
+          <w:szCs w:val="22"/>
+        </w:rPr>
+        <w:t>s</w:t>
+      </w:r>
+      <w:r>
+        <w:rPr>
+          <w:rFonts w:ascii="Times New Roman" w:hAnsi="Times New Roman" w:cs="Times New Roman"/>
+          <w:sz w:val="22"/>
+          <w:szCs w:val="22"/>
+        </w:rPr>
+        <w:t xml:space="preserve"> show the </w:t>
+      </w:r>
+      <w:r>
+        <w:rPr>
+          <w:rFonts w:ascii="Times New Roman" w:hAnsi="Times New Roman" w:cs="Times New Roman"/>
+          <w:sz w:val="22"/>
+          <w:szCs w:val="22"/>
+        </w:rPr>
+        <w:t>high-level</w:t>
+      </w:r>
+      <w:r>
+        <w:rPr>
+          <w:rFonts w:ascii="Times New Roman" w:hAnsi="Times New Roman" w:cs="Times New Roman"/>
+          <w:sz w:val="22"/>
+          <w:szCs w:val="22"/>
+        </w:rPr>
+        <w:t xml:space="preserve"> overview of the project timeline with the WBS created in Microsoft Project.</w:t>
+      </w:r>
+    </w:p>
+    <w:p>
+      <w:pPr>
+        <w:rPr>
+          <w:rFonts w:ascii="Times New Roman" w:hAnsi="Times New Roman" w:cs="Times New Roman"/>
+          <w:sz w:val="22"/>
+          <w:szCs w:val="22"/>
+        </w:rPr>
+      </w:pPr>
+      <w:r>
+        <w:rPr>
+          <w:rFonts w:ascii="Times New Roman" w:hAnsi="Times New Roman" w:cs="Times New Roman"/>
+          <w:noProof/>
+          <w:sz w:val="22"/>
+          <w:szCs w:val="22"/>
+        </w:rPr>
+        <w:drawing>
+          <wp:inline distT="0" distB="0" distL="0" distR="0" wp14:anchorId="5D4E471D" wp14:editId="1F0AFBBA">
+            <wp:extent cx="4435224" cy="1722269"/>
+            <wp:effectExtent l="0" t="0" r="3810" b="0"/>
+            <wp:docPr id="1405635778" name="Picture 1"/>
+            <wp:cNvGraphicFramePr>
+              <a:graphicFrameLocks xmlns:a="http://schemas.openxmlformats.org/drawingml/2006/main" noChangeAspect="1"/>
+            </wp:cNvGraphicFramePr>
+            <a:graphic xmlns:a="http://schemas.openxmlformats.org/drawingml/2006/main">
+              <a:graphicData uri="http://schemas.openxmlformats.org/drawingml/2006/picture">
+                <pic:pic xmlns:pic="http://schemas.openxmlformats.org/drawingml/2006/picture">
+                  <pic:nvPicPr>
+                    <pic:cNvPr id="1405635778" name=""/>
+                    <pic:cNvPicPr/>
+                  </pic:nvPicPr>
+                  <pic:blipFill>
+                    <a:blip r:embed="rId8"/>
+                    <a:stretch>
+                      <a:fillRect/>
+                    </a:stretch>
+                  </pic:blipFill>
+                  <pic:spPr>
+                    <a:xfrm>
+                      <a:off x="0" y="0"/>
+                      <a:ext cx="4435224" cy="1722269"/>
+                    </a:xfrm>
+                    <a:prstGeom prst="rect">
+                      <a:avLst/>
+                    </a:prstGeom>
+                  </pic:spPr>
+                </pic:pic>
+              </a:graphicData>
+            </a:graphic>
+          </wp:inline>
+        </w:drawing>
+      </w:r>
+    </w:p>
+    <w:p>
+      <w:pPr>
+        <w:rPr>
+          <w:rFonts w:ascii="Times New Roman" w:hAnsi="Times New Roman" w:cs="Times New Roman"/>
+          <w:sz w:val="22"/>
+          <w:szCs w:val="22"/>
+        </w:rPr>
+      </w:pPr>
+    </w:p>
+    <w:p>
+      <w:pPr>
+        <w:rPr>
+          <w:rFonts w:ascii="Times New Roman" w:hAnsi="Times New Roman" w:cs="Times New Roman"/>
+          <w:sz w:val="22"/>
+          <w:szCs w:val="22"/>
+        </w:rPr>
+      </w:pPr>
+      <w:r>
+        <w:rPr>
+          <w:rFonts w:ascii="Times New Roman" w:hAnsi="Times New Roman" w:cs="Times New Roman"/>
+          <w:noProof/>
+          <w:sz w:val="22"/>
+          <w:szCs w:val="22"/>
+        </w:rPr>
+        <w:drawing>
+          <wp:inline distT="0" distB="0" distL="0" distR="0" wp14:anchorId="7005D334" wp14:editId="2A8471F2">
+            <wp:extent cx="4732430" cy="3596952"/>
+            <wp:effectExtent l="0" t="0" r="0" b="3810"/>
+            <wp:docPr id="183997700" name="Picture 1"/>
+            <wp:cNvGraphicFramePr>
+              <a:graphicFrameLocks xmlns:a="http://schemas.openxmlformats.org/drawingml/2006/main" noChangeAspect="1"/>
+            </wp:cNvGraphicFramePr>
+            <a:graphic xmlns:a="http://schemas.openxmlformats.org/drawingml/2006/main">
+              <a:graphicData uri="http://schemas.openxmlformats.org/drawingml/2006/picture">
+                <pic:pic xmlns:pic="http://schemas.openxmlformats.org/drawingml/2006/picture">
+                  <pic:nvPicPr>
+                    <pic:cNvPr id="183997700" name=""/>
+                    <pic:cNvPicPr/>
+                  </pic:nvPicPr>
+                  <pic:blipFill>
+                    <a:blip r:embed="rId9"/>
+                    <a:stretch>
+                      <a:fillRect/>
+                    </a:stretch>
+                  </pic:blipFill>
+                  <pic:spPr>
+                    <a:xfrm>
+                      <a:off x="0" y="0"/>
+                      <a:ext cx="4732430" cy="3596952"/>
+                    </a:xfrm>
+                    <a:prstGeom prst="rect">
+                      <a:avLst/>
+                    </a:prstGeom>
+                  </pic:spPr>
+                </pic:pic>
+              </a:graphicData>
+            </a:graphic>
+          </wp:inline>
+        </w:drawing>
+      </w:r>
+    </w:p>
+    <w:p>
+      <w:pPr>
+        <w:rPr>
+          <w:rFonts w:ascii="Times New Roman" w:hAnsi="Times New Roman" w:cs="Times New Roman"/>
+          <w:sz w:val="22"/>
+          <w:szCs w:val="22"/>
+        </w:rPr>
+      </w:pPr>
+      <w:r>
+        <w:rPr>
+          <w:rFonts w:ascii="Times New Roman" w:hAnsi="Times New Roman" w:cs="Times New Roman"/>
+          <w:noProof/>
+          <w:sz w:val="22"/>
+          <w:szCs w:val="22"/>
+        </w:rPr>
+        <w:lastRenderedPageBreak/>
+        <w:drawing>
+          <wp:inline distT="0" distB="0" distL="0" distR="0" wp14:anchorId="1B6E0644" wp14:editId="15E1CA75">
+            <wp:extent cx="4265382" cy="3619500"/>
+            <wp:effectExtent l="0" t="0" r="1905" b="0"/>
+            <wp:docPr id="1202375653" name="Picture 1"/>
+            <wp:cNvGraphicFramePr>
+              <a:graphicFrameLocks xmlns:a="http://schemas.openxmlformats.org/drawingml/2006/main" noChangeAspect="1"/>
+            </wp:cNvGraphicFramePr>
+            <a:graphic xmlns:a="http://schemas.openxmlformats.org/drawingml/2006/main">
+              <a:graphicData uri="http://schemas.openxmlformats.org/drawingml/2006/picture">
+                <pic:pic xmlns:pic="http://schemas.openxmlformats.org/drawingml/2006/picture">
+                  <pic:nvPicPr>
+                    <pic:cNvPr id="1202375653" name=""/>
+                    <pic:cNvPicPr/>
+                  </pic:nvPicPr>
+                  <pic:blipFill>
+                    <a:blip r:embed="rId10"/>
+                    <a:stretch>
+                      <a:fillRect/>
+                    </a:stretch>
+                  </pic:blipFill>
+                  <pic:spPr>
+                    <a:xfrm>
+                      <a:off x="0" y="0"/>
+                      <a:ext cx="4271344" cy="3624559"/>
+                    </a:xfrm>
+                    <a:prstGeom prst="rect">
+                      <a:avLst/>
+                    </a:prstGeom>
+                  </pic:spPr>
+                </pic:pic>
+              </a:graphicData>
+            </a:graphic>
+          </wp:inline>
+        </w:drawing>
+      </w:r>
+    </w:p>
+    <w:p>
+      <w:pPr>
+        <w:rPr>
+          <w:rFonts w:ascii="Times New Roman" w:hAnsi="Times New Roman" w:cs="Times New Roman"/>
+          <w:sz w:val="22"/>
+          <w:szCs w:val="22"/>
+        </w:rPr>
+      </w:pPr>
+      <w:r>
+        <w:rPr>
+          <w:rFonts w:ascii="Times New Roman" w:hAnsi="Times New Roman" w:cs="Times New Roman"/>
+          <w:noProof/>
+          <w:sz w:val="22"/>
+          <w:szCs w:val="22"/>
+        </w:rPr>
+        <w:drawing>
+          <wp:inline distT="0" distB="0" distL="0" distR="0" wp14:anchorId="1E8E7E63" wp14:editId="0A8D129D">
+            <wp:extent cx="4282440" cy="3409383"/>
+            <wp:effectExtent l="0" t="0" r="3810" b="635"/>
+            <wp:docPr id="545397884" name="Picture 1"/>
+            <wp:cNvGraphicFramePr>
+              <a:graphicFrameLocks xmlns:a="http://schemas.openxmlformats.org/drawingml/2006/main" noChangeAspect="1"/>
+            </wp:cNvGraphicFramePr>
+            <a:graphic xmlns:a="http://schemas.openxmlformats.org/drawingml/2006/main">
+              <a:graphicData uri="http://schemas.openxmlformats.org/drawingml/2006/picture">
+                <pic:pic xmlns:pic="http://schemas.openxmlformats.org/drawingml/2006/picture">
+                  <pic:nvPicPr>
+                    <pic:cNvPr id="545397884" name=""/>
+                    <pic:cNvPicPr/>
+                  </pic:nvPicPr>
+                  <pic:blipFill>
+                    <a:blip r:embed="rId11"/>
+                    <a:stretch>
+                      <a:fillRect/>
+                    </a:stretch>
+                  </pic:blipFill>
+                  <pic:spPr>
+                    <a:xfrm>
+                      <a:off x="0" y="0"/>
+                      <a:ext cx="4285873" cy="3412116"/>
+                    </a:xfrm>
+                    <a:prstGeom prst="rect">
+                      <a:avLst/>
+                    </a:prstGeom>
+                  </pic:spPr>
+                </pic:pic>
+              </a:graphicData>
+            </a:graphic>
+          </wp:inline>
+        </w:drawing>
+      </w:r>
+    </w:p>
+    <w:p>
+      <w:pPr>
+        <w:rPr>
+          <w:rFonts w:ascii="Times New Roman" w:hAnsi="Times New Roman" w:cs="Times New Roman"/>
+          <w:sz w:val="22"/>
+          <w:szCs w:val="22"/>
+        </w:rPr>
+      </w:pPr>
+    </w:p>
+    <w:p>
+      <w:pPr>
+        <w:rPr>
+          <w:rFonts w:ascii="Times New Roman" w:hAnsi="Times New Roman" w:cs="Times New Roman"/>
+          <w:sz w:val="22"/>
+          <w:szCs w:val="22"/>
+        </w:rPr>
+      </w:pPr>
+    </w:p>
+    <w:p>
+      <w:pPr>
+        <w:pStyle w:val="Heading2"/>
+        <w:rPr>
+          <w:rFonts w:ascii="Times New Roman" w:hAnsi="Times New Roman" w:cs="Times New Roman"/>
+          <w:b/>
+          <w:bCs/>
+          <w:color w:val="auto"/>
+          <w:sz w:val="22"/>
+          <w:szCs w:val="22"/>
+        </w:rPr>
+      </w:pPr>
+      <w:bookmarkStart w:id="7" w:name="_Toc240579378"/>
+      <w:r>
+        <w:rPr>
+          <w:rFonts w:ascii="Times New Roman" w:hAnsi="Times New Roman" w:cs="Times New Roman"/>
+          <w:b/>
+          <w:bCs/>
+          <w:color w:val="auto"/>
+          <w:sz w:val="22"/>
+          <w:szCs w:val="22"/>
+        </w:rPr>
+        <w:lastRenderedPageBreak/>
+        <w:t>Project Timeline - Gantt Chart</w:t>
+      </w:r>
+      <w:bookmarkEnd w:id="7"/>
+    </w:p>
+    <w:p>
+      <w:pPr>
+        <w:rPr>
+          <w:rFonts w:ascii="Times New Roman" w:hAnsi="Times New Roman" w:cs="Times New Roman"/>
+          <w:sz w:val="22"/>
+          <w:szCs w:val="22"/>
+        </w:rPr>
+      </w:pPr>
+      <w:r>
+        <w:rPr>
+          <w:rFonts w:ascii="Times New Roman" w:hAnsi="Times New Roman" w:cs="Times New Roman"/>
+          <w:noProof/>
+          <w:sz w:val="22"/>
+          <w:szCs w:val="22"/>
+        </w:rPr>
+        <w:drawing>
+          <wp:anchor distT="0" distB="0" distL="114300" distR="114300" simplePos="0" relativeHeight="251658240" behindDoc="0" locked="0" layoutInCell="1" allowOverlap="1" wp14:anchorId="74D0030F" wp14:editId="62DC2A44">
+            <wp:simplePos x="0" y="0"/>
+            <wp:positionH relativeFrom="margin">
+              <wp:align>center</wp:align>
+            </wp:positionH>
+            <wp:positionV relativeFrom="paragraph">
+              <wp:posOffset>296545</wp:posOffset>
+            </wp:positionV>
+            <wp:extent cx="7235294" cy="2034540"/>
+            <wp:effectExtent l="0" t="0" r="3810" b="3810"/>
+            <wp:wrapNone/>
+            <wp:docPr id="405157370" name="Picture 1"/>
+            <wp:cNvGraphicFramePr>
+              <a:graphicFrameLocks xmlns:a="http://schemas.openxmlformats.org/drawingml/2006/main" noChangeAspect="1"/>
+            </wp:cNvGraphicFramePr>
+            <a:graphic xmlns:a="http://schemas.openxmlformats.org/drawingml/2006/main">
+              <a:graphicData uri="http://schemas.openxmlformats.org/drawingml/2006/picture">
+                <pic:pic xmlns:pic="http://schemas.openxmlformats.org/drawingml/2006/picture">
+                  <pic:nvPicPr>
+                    <pic:cNvPr id="405157370" name=""/>
+                    <pic:cNvPicPr/>
+                  </pic:nvPicPr>
+                  <pic:blipFill>
+                    <a:blip r:embed="rId12">
+                      <a:extLst>
+                        <a:ext uri="{28A0092B-C50C-407E-A947-70E740481C1C}">
+                          <a14:useLocalDpi xmlns:a14="http://schemas.microsoft.com/office/drawing/2010/main" val="0"/>
+                        </a:ext>
+                      </a:extLst>
+                    </a:blip>
+                    <a:stretch>
+                      <a:fillRect/>
+                    </a:stretch>
+                  </pic:blipFill>
+                  <pic:spPr>
+                    <a:xfrm>
+                      <a:off x="0" y="0"/>
+                      <a:ext cx="7235294" cy="2034540"/>
+                    </a:xfrm>
+                    <a:prstGeom prst="rect">
+                      <a:avLst/>
+                    </a:prstGeom>
+                  </pic:spPr>
+                </pic:pic>
+              </a:graphicData>
+            </a:graphic>
+            <wp14:sizeRelH relativeFrom="page">
+              <wp14:pctWidth>0</wp14:pctWidth>
+            </wp14:sizeRelH>
+            <wp14:sizeRelV relativeFrom="page">
+              <wp14:pctHeight>0</wp14:pctHeight>
+            </wp14:sizeRelV>
+          </wp:anchor>
+        </w:drawing>
+      </w:r>
+      <w:r>
+        <w:rPr>
+          <w:rFonts w:ascii="Times New Roman" w:hAnsi="Times New Roman" w:cs="Times New Roman"/>
+          <w:sz w:val="22"/>
+          <w:szCs w:val="22"/>
+        </w:rPr>
+        <w:t>The Gantt chart below sums up the project schedule across five phases and a 73-day total duration.</w:t>
+      </w:r>
+    </w:p>
+    <w:p>
+      <w:pPr>
+        <w:rPr>
+          <w:rFonts w:ascii="Times New Roman" w:hAnsi="Times New Roman" w:cs="Times New Roman"/>
+          <w:sz w:val="22"/>
+          <w:szCs w:val="22"/>
+        </w:rPr>
+      </w:pPr>
+    </w:p>
     <w:sectPr>
-      <w:headerReference w:type="default" r:id="rId8"/>
-      <w:footerReference w:type="default" r:id="rId9"/>
+      <w:headerReference w:type="default" r:id="rId13"/>
+      <w:footerReference w:type="default" r:id="rId14"/>
       <w:pgSz w:w="12240" w:h="15840"/>
       <w:pgMar w:top="1440" w:right="1440" w:bottom="1440" w:left="1440" w:header="720" w:footer="720" w:gutter="0"/>
       <w:cols w:space="720"/>

</xml_diff>

<commit_message>
Version 3.1 SRS Document Update
</commit_message>
<xml_diff>
--- a/CIS 4374 Project File.docx
+++ b/CIS 4374 Project File.docx
@@ -6,6 +6,8 @@
       <w:pPr>
         <w:rPr>
           <w:rFonts w:ascii="Times New Roman" w:hAnsi="Times New Roman" w:cs="Times New Roman"/>
+          <w:sz w:val="22"/>
+          <w:szCs w:val="22"/>
         </w:rPr>
       </w:pPr>
     </w:p>
@@ -13234,6 +13236,7 @@
       <w:r>
         <w:rPr>
           <w:rFonts w:ascii="Times New Roman" w:hAnsi="Times New Roman" w:cs="Times New Roman"/>
+          <w:noProof/>
           <w:sz w:val="22"/>
           <w:szCs w:val="22"/>
         </w:rPr>
@@ -16382,9 +16385,20 @@
           <w:sz w:val="26"/>
           <w:szCs w:val="26"/>
         </w:rPr>
-        <w:t>. Risk Management</w:t>
+        <w:t>. Risk Managemen</w:t>
       </w:r>
       <w:bookmarkEnd w:id="26"/>
+      <w:r>
+        <w:rPr>
+          <w:rFonts w:ascii="Times New Roman" w:hAnsi="Times New Roman" w:cs="Times New Roman"/>
+          <w:b/>
+          <w:bCs/>
+          <w:color w:val="0070C0"/>
+          <w:sz w:val="26"/>
+          <w:szCs w:val="26"/>
+        </w:rPr>
+        <w:t>t</w:t>
+      </w:r>
     </w:p>
     <w:p>
       <w:pPr>
@@ -16419,9 +16433,20 @@
           <w:sz w:val="22"/>
           <w:szCs w:val="22"/>
         </w:rPr>
-        <w:t>- Risk Register</w:t>
+        <w:t xml:space="preserve">- Risk </w:t>
       </w:r>
       <w:bookmarkEnd w:id="27"/>
+      <w:r>
+        <w:rPr>
+          <w:rFonts w:ascii="Times New Roman" w:hAnsi="Times New Roman" w:cs="Times New Roman"/>
+          <w:b/>
+          <w:bCs/>
+          <w:color w:val="0070C0"/>
+          <w:sz w:val="22"/>
+          <w:szCs w:val="22"/>
+        </w:rPr>
+        <w:t>Categories</w:t>
+      </w:r>
     </w:p>
     <w:p>
       <w:pPr>

</xml_diff>

<commit_message>
SRS Version 3.2 Resource and Cost Management
</commit_message>
<xml_diff>
--- a/CIS 4374 Project File.docx
+++ b/CIS 4374 Project File.docx
@@ -35888,7 +35888,31 @@
           <w:sz w:val="22"/>
           <w:szCs w:val="22"/>
         </w:rPr>
-        <w:t xml:space="preserve">7. The actual spending numbers would be compared against the cost baseline as the project makes progress. </w:t>
+        <w:t>7. The actual spending numbers</w:t>
+      </w:r>
+      <w:r>
+        <w:rPr>
+          <w:rFonts w:ascii="Times New Roman" w:hAnsi="Times New Roman" w:cs="Times New Roman"/>
+          <w:sz w:val="22"/>
+          <w:szCs w:val="22"/>
+        </w:rPr>
+        <w:t xml:space="preserve"> and statistics</w:t>
+      </w:r>
+      <w:r>
+        <w:rPr>
+          <w:rFonts w:ascii="Times New Roman" w:hAnsi="Times New Roman" w:cs="Times New Roman"/>
+          <w:sz w:val="22"/>
+          <w:szCs w:val="22"/>
+        </w:rPr>
+        <w:t xml:space="preserve"> would be compared against the cost baseline as the project makes progres</w:t>
+      </w:r>
+      <w:r>
+        <w:rPr>
+          <w:rFonts w:ascii="Times New Roman" w:hAnsi="Times New Roman" w:cs="Times New Roman"/>
+          <w:sz w:val="22"/>
+          <w:szCs w:val="22"/>
+        </w:rPr>
+        <w:t>s.</w:t>
       </w:r>
     </w:p>
     <w:p>

</xml_diff>

<commit_message>
CIS 4374 SRS Version 3.2 Update
CIS 4374 SRS Version 3.2 Update Resources and Cost Management Plan
</commit_message>
<xml_diff>
--- a/CIS 4374 Project File.docx
+++ b/CIS 4374 Project File.docx
@@ -35826,7 +35826,23 @@
           <w:sz w:val="22"/>
           <w:szCs w:val="22"/>
         </w:rPr>
-        <w:t>4. Clod, mapping, payment, and development-tool costs are estimated monthly.</w:t>
+        <w:t>4. Clo</w:t>
+      </w:r>
+      <w:r>
+        <w:rPr>
+          <w:rFonts w:ascii="Times New Roman" w:hAnsi="Times New Roman" w:cs="Times New Roman"/>
+          <w:sz w:val="22"/>
+          <w:szCs w:val="22"/>
+        </w:rPr>
+        <w:t>u</w:t>
+      </w:r>
+      <w:r>
+        <w:rPr>
+          <w:rFonts w:ascii="Times New Roman" w:hAnsi="Times New Roman" w:cs="Times New Roman"/>
+          <w:sz w:val="22"/>
+          <w:szCs w:val="22"/>
+        </w:rPr>
+        <w:t>d, mapping, payment, and development-tool costs are estimated monthly.</w:t>
       </w:r>
     </w:p>
     <w:p>

</xml_diff>

<commit_message>
CIS 4374 Project Management Plan Update Week 7
CIS 4374 Project Management Plan Update Week 7
</commit_message>
<xml_diff>
--- a/CIS 4374 Project File.docx
+++ b/CIS 4374 Project File.docx
@@ -44492,28 +44492,6 @@
     </w:p>
     <w:p>
       <w:pPr>
-        <w:rPr>
-          <w:rFonts w:ascii="Times New Roman" w:hAnsi="Times New Roman" w:cs="Times New Roman"/>
-          <w:b/>
-          <w:bCs/>
-          <w:sz w:val="22"/>
-          <w:szCs w:val="22"/>
-        </w:rPr>
-      </w:pPr>
-    </w:p>
-    <w:p>
-      <w:pPr>
-        <w:rPr>
-          <w:rFonts w:ascii="Times New Roman" w:hAnsi="Times New Roman" w:cs="Times New Roman"/>
-          <w:b/>
-          <w:bCs/>
-          <w:sz w:val="22"/>
-          <w:szCs w:val="22"/>
-        </w:rPr>
-      </w:pPr>
-    </w:p>
-    <w:p>
-      <w:pPr>
         <w:pStyle w:val="Heading2"/>
         <w:rPr>
           <w:rFonts w:ascii="Times New Roman" w:hAnsi="Times New Roman" w:cs="Times New Roman"/>
@@ -44779,7 +44757,6 @@
         <w:rPr>
           <w:rFonts w:ascii="Times New Roman" w:hAnsi="Times New Roman" w:cs="Times New Roman"/>
         </w:rPr>
-        <w:lastRenderedPageBreak/>
         <w:t>Discuss things respectfully and escalate issues to the appropriate role</w:t>
       </w:r>
     </w:p>
@@ -44826,6 +44803,7 @@
           <w:sz w:val="22"/>
           <w:szCs w:val="22"/>
         </w:rPr>
+        <w:lastRenderedPageBreak/>
         <w:t>12.</w:t>
       </w:r>
       <w:r>

</xml_diff>